<commit_message>
Update Task Info WBS 24; Upload new git command guides
</commit_message>
<xml_diff>
--- a/Documentation/Analysis/Task Informations/Open/Sajad/Task Info WBS-24 - W.docx
+++ b/Documentation/Analysis/Task Informations/Open/Sajad/Task Info WBS-24 - W.docx
@@ -456,16 +456,7 @@
                 <w:sz w:val="27"/>
                 <w:szCs w:val="27"/>
               </w:rPr>
-              <w:t>Estimation</w:t>
-            </w:r>
-            <w:r>
-              <w:rPr>
-                <w:rFonts w:ascii="-webkit-standard" w:hAnsi="-webkit-standard"/>
-                <w:color w:val="000000"/>
-                <w:sz w:val="27"/>
-                <w:szCs w:val="27"/>
-              </w:rPr>
-              <w:t>.pages</w:t>
+              <w:t>Estimation.pages</w:t>
             </w:r>
             <w:proofErr w:type="spellEnd"/>
             <w:r>
@@ -711,6 +702,54 @@
               </w:rPr>
               <w:t>Teacher’s notes</w:t>
             </w:r>
+            <w:r>
+              <w:rPr>
+                <w:rFonts w:ascii="Carlito" w:hAnsi="Carlito" w:cs="Arial Unicode MS"/>
+                <w:color w:val="000000"/>
+                <w:kern w:val="2"/>
+                <w:sz w:val="28"/>
+                <w:szCs w:val="28"/>
+                <w:u w:color="000000"/>
+                <w14:textOutline w14:w="0" w14:cap="flat" w14:cmpd="sng" w14:algn="ctr">
+                  <w14:noFill/>
+                  <w14:prstDash w14:val="solid"/>
+                  <w14:bevel/>
+                </w14:textOutline>
+              </w:rPr>
+              <w:t xml:space="preserve">, </w:t>
+            </w:r>
+            <w:r>
+              <w:rPr>
+                <w:rFonts w:ascii="Carlito" w:hAnsi="Carlito" w:cs="Arial Unicode MS"/>
+                <w:color w:val="000000"/>
+                <w:kern w:val="2"/>
+                <w:sz w:val="28"/>
+                <w:szCs w:val="28"/>
+                <w:u w:color="000000"/>
+                <w14:textOutline w14:w="0" w14:cap="flat" w14:cmpd="sng" w14:algn="ctr">
+                  <w14:noFill/>
+                  <w14:prstDash w14:val="solid"/>
+                  <w14:bevel/>
+                </w14:textOutline>
+              </w:rPr>
+              <w:t>Systems Analysis and Design by David P</w:t>
+            </w:r>
+            <w:r>
+              <w:rPr>
+                <w:rFonts w:ascii="Carlito" w:hAnsi="Carlito" w:cs="Arial Unicode MS"/>
+                <w:color w:val="000000"/>
+                <w:kern w:val="2"/>
+                <w:sz w:val="28"/>
+                <w:szCs w:val="28"/>
+                <w:u w:color="000000"/>
+                <w14:textOutline w14:w="0" w14:cap="flat" w14:cmpd="sng" w14:algn="ctr">
+                  <w14:noFill/>
+                  <w14:prstDash w14:val="solid"/>
+                  <w14:bevel/>
+                </w14:textOutline>
+              </w:rPr>
+              <w:t>- P880</w:t>
+            </w:r>
           </w:p>
         </w:tc>
         <w:tc>
@@ -788,15 +827,7 @@
                 <w:sz w:val="28"/>
                 <w:szCs w:val="28"/>
               </w:rPr>
-              <w:t>5</w:t>
-            </w:r>
-            <w:r>
-              <w:rPr>
-                <w:rFonts w:ascii="Carlito" w:hAnsi="Carlito"/>
-                <w:sz w:val="28"/>
-                <w:szCs w:val="28"/>
-              </w:rPr>
-              <w:t xml:space="preserve"> hours</w:t>
+              <w:t>5 hours</w:t>
             </w:r>
           </w:p>
         </w:tc>
@@ -2304,7 +2335,7 @@
   <w:num w:numId="3" w16cid:durableId="758646315">
     <w:abstractNumId w:val="0"/>
     <w:lvlOverride w:ilvl="0">
-      <w:lvl w:ilvl="0" w:tplc="1806E5BA">
+      <w:lvl w:ilvl="0" w:tplc="699886F2">
         <w:start w:val="1"/>
         <w:numFmt w:val="bullet"/>
         <w:lvlText w:val="·"/>
@@ -2336,7 +2367,7 @@
       </w:lvl>
     </w:lvlOverride>
     <w:lvlOverride w:ilvl="1">
-      <w:lvl w:ilvl="1" w:tplc="BD6A3810">
+      <w:lvl w:ilvl="1" w:tplc="656AE936">
         <w:start w:val="1"/>
         <w:numFmt w:val="bullet"/>
         <w:lvlText w:val="o"/>
@@ -2368,7 +2399,7 @@
       </w:lvl>
     </w:lvlOverride>
     <w:lvlOverride w:ilvl="2">
-      <w:lvl w:ilvl="2" w:tplc="3A845B82">
+      <w:lvl w:ilvl="2" w:tplc="3A0A1CB0">
         <w:start w:val="1"/>
         <w:numFmt w:val="bullet"/>
         <w:lvlText w:val="▪"/>
@@ -2400,7 +2431,7 @@
       </w:lvl>
     </w:lvlOverride>
     <w:lvlOverride w:ilvl="3">
-      <w:lvl w:ilvl="3" w:tplc="1DFA89CC">
+      <w:lvl w:ilvl="3" w:tplc="E5BE6D04">
         <w:start w:val="1"/>
         <w:numFmt w:val="bullet"/>
         <w:lvlText w:val="·"/>
@@ -2432,7 +2463,7 @@
       </w:lvl>
     </w:lvlOverride>
     <w:lvlOverride w:ilvl="4">
-      <w:lvl w:ilvl="4" w:tplc="E138C5B4">
+      <w:lvl w:ilvl="4" w:tplc="A39C1582">
         <w:start w:val="1"/>
         <w:numFmt w:val="bullet"/>
         <w:lvlText w:val="o"/>
@@ -2464,7 +2495,7 @@
       </w:lvl>
     </w:lvlOverride>
     <w:lvlOverride w:ilvl="5">
-      <w:lvl w:ilvl="5" w:tplc="172C4AF0">
+      <w:lvl w:ilvl="5" w:tplc="9B3E302E">
         <w:start w:val="1"/>
         <w:numFmt w:val="bullet"/>
         <w:lvlText w:val="▪"/>
@@ -2496,7 +2527,7 @@
       </w:lvl>
     </w:lvlOverride>
     <w:lvlOverride w:ilvl="6">
-      <w:lvl w:ilvl="6" w:tplc="6A10543C">
+      <w:lvl w:ilvl="6" w:tplc="9C304EAC">
         <w:start w:val="1"/>
         <w:numFmt w:val="bullet"/>
         <w:lvlText w:val="·"/>
@@ -2528,7 +2559,7 @@
       </w:lvl>
     </w:lvlOverride>
     <w:lvlOverride w:ilvl="7">
-      <w:lvl w:ilvl="7" w:tplc="088C4550">
+      <w:lvl w:ilvl="7" w:tplc="991657CA">
         <w:start w:val="1"/>
         <w:numFmt w:val="bullet"/>
         <w:lvlText w:val="o"/>
@@ -2560,7 +2591,7 @@
       </w:lvl>
     </w:lvlOverride>
     <w:lvlOverride w:ilvl="8">
-      <w:lvl w:ilvl="8" w:tplc="8A649BF8">
+      <w:lvl w:ilvl="8" w:tplc="51FEFADC">
         <w:start w:val="1"/>
         <w:numFmt w:val="bullet"/>
         <w:lvlText w:val="▪"/>

</xml_diff>

<commit_message>
last-minute update on old WBS; Update task info wbs-24
</commit_message>
<xml_diff>
--- a/Documentation/Analysis/Task Informations/Open/Sajad/Task Info WBS-24 - W.docx
+++ b/Documentation/Analysis/Task Informations/Open/Sajad/Task Info WBS-24 - W.docx
@@ -127,7 +127,7 @@
                   <w14:bevel/>
                 </w14:textOutline>
               </w:rPr>
-              <w:t>Make Team Charter</w:t>
+              <w:t>Perform Effort and Size Estimation (UCP method)</w:t>
             </w:r>
           </w:p>
         </w:tc>
@@ -2335,7 +2335,7 @@
   <w:num w:numId="3" w16cid:durableId="758646315">
     <w:abstractNumId w:val="0"/>
     <w:lvlOverride w:ilvl="0">
-      <w:lvl w:ilvl="0" w:tplc="699886F2">
+      <w:lvl w:ilvl="0" w:tplc="3A18100E">
         <w:start w:val="1"/>
         <w:numFmt w:val="bullet"/>
         <w:lvlText w:val="·"/>
@@ -2367,7 +2367,7 @@
       </w:lvl>
     </w:lvlOverride>
     <w:lvlOverride w:ilvl="1">
-      <w:lvl w:ilvl="1" w:tplc="656AE936">
+      <w:lvl w:ilvl="1" w:tplc="636ECC58">
         <w:start w:val="1"/>
         <w:numFmt w:val="bullet"/>
         <w:lvlText w:val="o"/>
@@ -2399,7 +2399,7 @@
       </w:lvl>
     </w:lvlOverride>
     <w:lvlOverride w:ilvl="2">
-      <w:lvl w:ilvl="2" w:tplc="3A0A1CB0">
+      <w:lvl w:ilvl="2" w:tplc="FEBADF22">
         <w:start w:val="1"/>
         <w:numFmt w:val="bullet"/>
         <w:lvlText w:val="▪"/>
@@ -2431,7 +2431,7 @@
       </w:lvl>
     </w:lvlOverride>
     <w:lvlOverride w:ilvl="3">
-      <w:lvl w:ilvl="3" w:tplc="E5BE6D04">
+      <w:lvl w:ilvl="3" w:tplc="DB7A7B82">
         <w:start w:val="1"/>
         <w:numFmt w:val="bullet"/>
         <w:lvlText w:val="·"/>
@@ -2463,7 +2463,7 @@
       </w:lvl>
     </w:lvlOverride>
     <w:lvlOverride w:ilvl="4">
-      <w:lvl w:ilvl="4" w:tplc="A39C1582">
+      <w:lvl w:ilvl="4" w:tplc="9822B512">
         <w:start w:val="1"/>
         <w:numFmt w:val="bullet"/>
         <w:lvlText w:val="o"/>
@@ -2495,7 +2495,7 @@
       </w:lvl>
     </w:lvlOverride>
     <w:lvlOverride w:ilvl="5">
-      <w:lvl w:ilvl="5" w:tplc="9B3E302E">
+      <w:lvl w:ilvl="5" w:tplc="1EFCF946">
         <w:start w:val="1"/>
         <w:numFmt w:val="bullet"/>
         <w:lvlText w:val="▪"/>
@@ -2527,7 +2527,7 @@
       </w:lvl>
     </w:lvlOverride>
     <w:lvlOverride w:ilvl="6">
-      <w:lvl w:ilvl="6" w:tplc="9C304EAC">
+      <w:lvl w:ilvl="6" w:tplc="7BE68A84">
         <w:start w:val="1"/>
         <w:numFmt w:val="bullet"/>
         <w:lvlText w:val="·"/>
@@ -2559,7 +2559,7 @@
       </w:lvl>
     </w:lvlOverride>
     <w:lvlOverride w:ilvl="7">
-      <w:lvl w:ilvl="7" w:tplc="991657CA">
+      <w:lvl w:ilvl="7" w:tplc="587A9CDC">
         <w:start w:val="1"/>
         <w:numFmt w:val="bullet"/>
         <w:lvlText w:val="o"/>
@@ -2591,7 +2591,7 @@
       </w:lvl>
     </w:lvlOverride>
     <w:lvlOverride w:ilvl="8">
-      <w:lvl w:ilvl="8" w:tplc="51FEFADC">
+      <w:lvl w:ilvl="8" w:tplc="2596492E">
         <w:start w:val="1"/>
         <w:numFmt w:val="bullet"/>
         <w:lvlText w:val="▪"/>

</xml_diff>